<commit_message>
Compose la légende « Figure X.Y – Titre » en sortie Word
Word ne numérote pas les figures produites par pandoc : le filtre compose
désormais l'étiquette lui-même, comme le fait \caption côté LaTeX.

Co-Authored-By: Claude Opus 5 <noreply@anthropic.com>
Claude-Session: https://claude.ai/code/session_01Hs8PVJaTgyjq9e8Ud5Nqb9
</commit_message>
<xml_diff>
--- a/chapitre_1_migration_tiers_spo.docx
+++ b/chapitre_1_migration_tiers_spo.docx
@@ -928,7 +928,7 @@
         <w:pStyle w:val="ImageCaption"/>
       </w:pPr>
       <w:r>
-        <w:t xml:space="preserve">La chaîne de traitement à trois étages du fichier de travail</w:t>
+        <w:t xml:space="preserve">Figure 1.1 – La chaîne de traitement à trois étages du fichier de travail</w:t>
       </w:r>
     </w:p>
     <w:p>
@@ -1275,7 +1275,7 @@
         <w:pStyle w:val="ImageCaption"/>
       </w:pPr>
       <w:r>
-        <w:t xml:space="preserve">L’interface du module DirectAPI, ressource « Tiers » : chaque objet rattaché appelle son propre fichier d’import</w:t>
+        <w:t xml:space="preserve">Figure 1.2 – L’interface du module DirectAPI, ressource « Tiers » : chaque objet rattaché appelle son propre fichier d’import</w:t>
       </w:r>
     </w:p>
     <w:p>
@@ -1966,7 +1966,7 @@
         <w:pStyle w:val="ImageCaption"/>
       </w:pPr>
       <w:r>
-        <w:t xml:space="preserve">De 1 602 lignes brutes à 1 434 tiers créés : l’effet des deux filtres successifs</w:t>
+        <w:t xml:space="preserve">Figure 1.3 – De 1 602 lignes brutes à 1 434 tiers créés : l’effet des deux filtres successifs</w:t>
       </w:r>
     </w:p>
     <w:bookmarkEnd w:id="36"/>
@@ -2264,7 +2264,7 @@
         <w:pStyle w:val="ImageCaption"/>
       </w:pPr>
       <w:r>
-        <w:t xml:space="preserve">Les six fichiers d’import produits par la feuille pivot</w:t>
+        <w:t xml:space="preserve">Figure 1.4 – Les six fichiers d’import produits par la feuille pivot</w:t>
       </w:r>
     </w:p>
     <w:p>
@@ -3809,7 +3809,7 @@
         <w:pStyle w:val="ImageCaption"/>
       </w:pPr>
       <w:r>
-        <w:t xml:space="preserve">Répartition des 1 434 tiers créés selon leur nature</w:t>
+        <w:t xml:space="preserve">Figure 1.5 – Répartition des 1 434 tiers créés selon leur nature</w:t>
       </w:r>
     </w:p>
     <w:p>

</xml_diff>

<commit_message>
Corrige deux formulations hors périmètre et une redondance
- retire l'affirmation sur la restriction codée dans la plateforme et
  celle sur l'absence de champ dédié aux remises : ni l'une ni l'autre
  ne figure dans le brouillon
- reformule « ces doublons seraient créés en double » au chapitre 1

Co-Authored-By: Claude Opus 5 <noreply@anthropic.com>
Claude-Session: https://claude.ai/code/session_01Hs8PVJaTgyjq9e8Ud5Nqb9
</commit_message>
<xml_diff>
--- a/chapitre_1_migration_tiers_spo.docx
+++ b/chapitre_1_migration_tiers_spo.docx
@@ -1788,13 +1788,13 @@
         <w:t xml:space="preserve"> </w:t>
       </w:r>
       <w:r>
-        <w:t xml:space="preserve">une partie des doublons, et ces doublons seraient créés en double sans que personne s’en</w:t>
-      </w:r>
-      <w:r>
-        <w:t xml:space="preserve"> </w:t>
-      </w:r>
-      <w:r>
-        <w:t xml:space="preserve">aperçoive avant longtemps. Tester les deux sens double la longueur de la formule, mais</w:t>
+        <w:t xml:space="preserve">une partie des doublons, et les tiers concernés seraient créés une seconde fois sans que</w:t>
+      </w:r>
+      <w:r>
+        <w:t xml:space="preserve"> </w:t>
+      </w:r>
+      <w:r>
+        <w:t xml:space="preserve">personne s’en aperçoive avant longtemps. Tester les deux sens allonge la formule, mais</w:t>
       </w:r>
       <w:r>
         <w:t xml:space="preserve"> </w:t>

</xml_diff>

<commit_message>
Lève une tension logique sur les tiers reclassés du chapitre 1
Co-Authored-By: Claude Opus 5 <noreply@anthropic.com>
Claude-Session: https://claude.ai/code/session_01Hs8PVJaTgyjq9e8Ud5Nqb9
</commit_message>
<xml_diff>
--- a/chapitre_1_migration_tiers_spo.docx
+++ b/chapitre_1_migration_tiers_spo.docx
@@ -3214,13 +3214,13 @@
         <w:t xml:space="preserve"> </w:t>
       </w:r>
       <w:r>
-        <w:t xml:space="preserve">reçoit. L’un de ces trois cas était en réalité déjà créé dans SPO par un autre canal, et il</w:t>
-      </w:r>
-      <w:r>
-        <w:t xml:space="preserve"> </w:t>
-      </w:r>
-      <w:r>
-        <w:t xml:space="preserve">a donc été retiré du fichier d’import.</w:t>
+        <w:t xml:space="preserve">reçoit. L’un d’eux, en revanche, était déjà créé dans SPO par un autre canal : il a été</w:t>
+      </w:r>
+      <w:r>
+        <w:t xml:space="preserve"> </w:t>
+      </w:r>
+      <w:r>
+        <w:t xml:space="preserve">retiré du fichier d’import plutôt que reclassé.</w:t>
       </w:r>
     </w:p>
     <w:p>

</xml_diff>

<commit_message>
Rapproche l'écriture des marqueurs du mémoire de mi-parcours
Le mi-parcours emploie 19 participes présents détachés en fin de phrase
là où les deux chapitres n'en comptaient qu'un chacun, et abusaient à la
place de « , ce qui ». Quatorze tournures converties, plus un « nous »
sur la restriction de périmètre demandée par l'entreprise.

Co-Authored-By: Claude Opus 5 <noreply@anthropic.com>
Claude-Session: https://claude.ai/code/session_01Hs8PVJaTgyjq9e8Ud5Nqb9
</commit_message>
<xml_diff>
--- a/chapitre_1_migration_tiers_spo.docx
+++ b/chapitre_1_migration_tiers_spo.docx
@@ -473,13 +473,19 @@
         <w:t xml:space="preserve"> </w:t>
       </w:r>
       <w:r>
-        <w:t xml:space="preserve">ligne de l’extraction Vadimm ne décrit pas un client, elle décrit une vente. Un même acquéreur qui a</w:t>
-      </w:r>
-      <w:r>
-        <w:t xml:space="preserve"> </w:t>
-      </w:r>
-      <w:r>
-        <w:t xml:space="preserve">acheté trois lots apparaît donc trois fois, et rien dans le fichier ne le signale.</w:t>
+        <w:t xml:space="preserve">ligne de l’extraction Vadimm ne décrit pas un client, elle décrit une vente. Un même</w:t>
+      </w:r>
+      <w:r>
+        <w:t xml:space="preserve"> </w:t>
+      </w:r>
+      <w:r>
+        <w:t xml:space="preserve">acquéreur qui a acheté trois lots apparaît donc trois fois, et rien dans le fichier ne le</w:t>
+      </w:r>
+      <w:r>
+        <w:t xml:space="preserve"> </w:t>
+      </w:r>
+      <w:r>
+        <w:t xml:space="preserve">signale.</w:t>
       </w:r>
       <w:r>
         <w:t xml:space="preserve"> </w:t>
@@ -1598,7 +1604,7 @@
         <w:t xml:space="preserve"> </w:t>
       </w:r>
       <w:r>
-        <w:t xml:space="preserve">visibles, avec leur rang, ce qui permet à tout moment de vérifier pourquoi une ligne n’a</w:t>
+        <w:t xml:space="preserve">visibles, avec leur rang, permettant à tout moment de vérifier pourquoi une ligne n’a</w:t>
       </w:r>
       <w:r>
         <w:t xml:space="preserve"> </w:t>
@@ -1618,13 +1624,13 @@
         <w:t xml:space="preserve"> </w:t>
       </w:r>
       <w:r>
-        <w:t xml:space="preserve">ce travail. En effet, il traduit une idée simple : la règle d’unicité n’est pas une propriété du</w:t>
-      </w:r>
-      <w:r>
-        <w:t xml:space="preserve"> </w:t>
-      </w:r>
-      <w:r>
-        <w:t xml:space="preserve">fichier, c’est une propriété du métier. Chercher une clé universelle aurait conduit soit à</w:t>
+        <w:t xml:space="preserve">ce travail. En effet, il traduit une idée simple : la règle d’unicité n’est pas une</w:t>
+      </w:r>
+      <w:r>
+        <w:t xml:space="preserve"> </w:t>
+      </w:r>
+      <w:r>
+        <w:t xml:space="preserve">propriété du fichier, c’est une propriété du métier. Chercher une clé universelle aurait conduit soit à</w:t>
       </w:r>
       <w:r>
         <w:t xml:space="preserve"> </w:t>
@@ -1880,7 +1886,7 @@
         <w:t xml:space="preserve"> </w:t>
       </w:r>
       <w:r>
-        <w:t xml:space="preserve">achats répétés, ce qui ramène à 1 474 tiers uniques ; l’exclusion des tiers déjà présents</w:t>
+        <w:t xml:space="preserve">achats répétés, ramenant le total à 1 474 tiers uniques ; l’exclusion des tiers déjà présents</w:t>
       </w:r>
       <w:r>
         <w:t xml:space="preserve"> </w:t>
@@ -3901,7 +3907,7 @@
         <w:t xml:space="preserve"> </w:t>
       </w:r>
       <w:r>
-        <w:t xml:space="preserve">trois manipulations ne produit de message d’erreur, ce qui les rend d’autant plus</w:t>
+        <w:t xml:space="preserve">trois manipulations ne produit de message d’erreur, les rendant d’autant plus</w:t>
       </w:r>
       <w:r>
         <w:t xml:space="preserve"> </w:t>
@@ -3995,7 +4001,7 @@
         <w:t xml:space="preserve"> </w:t>
       </w:r>
       <w:r>
-        <w:t xml:space="preserve">un code de minutes selon le contexte, ce qui produit des clés de déduplication fausses</w:t>
+        <w:t xml:space="preserve">un code de minutes selon le contexte, produisant des clés de déduplication fausses</w:t>
       </w:r>
       <w:r>
         <w:t xml:space="preserve"> </w:t>
@@ -4041,13 +4047,13 @@
         <w:t xml:space="preserve"> </w:t>
       </w:r>
       <w:r>
-        <w:t xml:space="preserve">l’affichage étaient donc considérées comme différentes par le tableur, ce qui cassait</w:t>
-      </w:r>
-      <w:r>
-        <w:t xml:space="preserve"> </w:t>
-      </w:r>
-      <w:r>
-        <w:t xml:space="preserve">la déduplication des personnes physiques. La normalisation systématique des dates à</w:t>
+        <w:t xml:space="preserve">l’affichage étaient donc considérées comme différentes par le tableur, cassant la</w:t>
+      </w:r>
+      <w:r>
+        <w:t xml:space="preserve"> </w:t>
+      </w:r>
+      <w:r>
+        <w:t xml:space="preserve">déduplication des personnes physiques. La normalisation systématique des dates à</w:t>
       </w:r>
       <w:r>
         <w:t xml:space="preserve"> </w:t>
@@ -4157,7 +4163,7 @@
         <w:t xml:space="preserve"> </w:t>
       </w:r>
       <w:r>
-        <w:t xml:space="preserve">cellules de formules, ce qui rend le recalcul automatique pénible pendant les phases de</w:t>
+        <w:t xml:space="preserve">cellules de formules, rendant le recalcul automatique pénible pendant les phases de</w:t>
       </w:r>
       <w:r>
         <w:t xml:space="preserve"> </w:t>

</xml_diff>

<commit_message>
Applique les corrections de l'audit du chapitre 1
Deux défauts bloquants levés : la contradiction de volumétrie entre
1 602 et 1 557 lignes sources, et l'affirmation que les budgets avaient
été migrés au premier semestre, que le mémoire de mi-parcours dément.

Retire par ailleurs onze affirmations non rattachables à la note de
synthèse, porte à quatre le décompte des manipulations interdites,
corrige la glose d'ADV, aligne le commentaire de la figure DirectAPI sur
ce que la capture montre réellement, et rend insécables les séparateurs
de milliers des deux chapitres.

Co-Authored-By: Claude Opus 5 <noreply@anthropic.com>
Claude-Session: https://claude.ai/code/session_01Hs8PVJaTgyjq9e8Ud5Nqb9
</commit_message>
<xml_diff>
--- a/chapitre_1_migration_tiers_spo.docx
+++ b/chapitre_1_migration_tiers_spo.docx
@@ -266,7 +266,7 @@
         <w:t xml:space="preserve"> </w:t>
       </w:r>
       <w:r>
-        <w:t xml:space="preserve">notre système historique vers le nouvel ERP du groupe, SPO. Cette mission prolonge</w:t>
+        <w:t xml:space="preserve">notre CRM Vadimm vers le nouvel ERP du groupe, SPO. Cette mission prolonge</w:t>
       </w:r>
       <w:r>
         <w:t xml:space="preserve"> </w:t>
@@ -346,19 +346,19 @@
         <w:t xml:space="preserve"> </w:t>
       </w:r>
       <w:r>
-        <w:t xml:space="preserve">immobilières, de leurs tranches et de leurs budgets, il restait à reprendre les données</w:t>
-      </w:r>
-      <w:r>
-        <w:t xml:space="preserve"> </w:t>
-      </w:r>
-      <w:r>
-        <w:t xml:space="preserve">commerciales, et en premier lieu les clients. Dans SPO, ces clients sont désignés par le</w:t>
-      </w:r>
-      <w:r>
-        <w:t xml:space="preserve"> </w:t>
-      </w:r>
-      <w:r>
-        <w:t xml:space="preserve">terme générique de</w:t>
+        <w:t xml:space="preserve">immobilières et de leurs tranches, il restait à reprendre les données commerciales, et en</w:t>
+      </w:r>
+      <w:r>
+        <w:t xml:space="preserve"> </w:t>
+      </w:r>
+      <w:r>
+        <w:t xml:space="preserve">premier lieu les clients. Dans SPO (Suivi des Programmes Opérationnels), ces clients sont</w:t>
+      </w:r>
+      <w:r>
+        <w:t xml:space="preserve"> </w:t>
+      </w:r>
+      <w:r>
+        <w:t xml:space="preserve">désignés par le terme générique de</w:t>
       </w:r>
       <w:r>
         <w:t xml:space="preserve"> </w:t>
@@ -374,13 +374,13 @@
         <w:t xml:space="preserve"> </w:t>
       </w:r>
       <w:r>
-        <w:t xml:space="preserve">: la même entité de base sert à représenter un acquéreur, une</w:t>
-      </w:r>
-      <w:r>
-        <w:t xml:space="preserve"> </w:t>
-      </w:r>
-      <w:r>
-        <w:t xml:space="preserve">société, un prescripteur ou un fournisseur, et se voit ensuite attribuer un ou plusieurs</w:t>
+        <w:t xml:space="preserve">: la même entité de base sert à représenter un</w:t>
+      </w:r>
+      <w:r>
+        <w:t xml:space="preserve"> </w:t>
+      </w:r>
+      <w:r>
+        <w:t xml:space="preserve">acquéreur particulier comme une société, et se voit ensuite attribuer un ou plusieurs</w:t>
       </w:r>
       <w:r>
         <w:t xml:space="preserve"> </w:t>
@@ -428,32 +428,38 @@
         <w:t xml:space="preserve"> </w:t>
       </w:r>
       <w:r>
-        <w:t xml:space="preserve">la forme d’une extraction de toutes les ventes enregistrées. Cette extraction comptait</w:t>
-      </w:r>
-      <w:r>
-        <w:t xml:space="preserve"> </w:t>
-      </w:r>
-      <w:r>
-        <w:rPr>
-          <w:bCs/>
-          <w:b/>
-        </w:rPr>
-        <w:t xml:space="preserve">1 602 lignes</w:t>
-      </w:r>
-      <w:r>
-        <w:t xml:space="preserve">, auxquelles s’ajoutait une seconde extraction, réalisée avec MyReport</w:t>
-      </w:r>
-      <w:r>
-        <w:t xml:space="preserve"> </w:t>
-      </w:r>
-      <w:r>
-        <w:t xml:space="preserve">Builder, portant les coordonnées de contact des acquéreurs et de leurs co-acquéreurs :</w:t>
-      </w:r>
-      <w:r>
-        <w:t xml:space="preserve"> </w:t>
-      </w:r>
-      <w:r>
-        <w:t xml:space="preserve">adresses postales, courriels et numéros de téléphone.</w:t>
+        <w:t xml:space="preserve">la forme de deux extractions complémentaires : celle des ventes enregistrées, qui porte</w:t>
+      </w:r>
+      <w:r>
+        <w:t xml:space="preserve"> </w:t>
+      </w:r>
+      <w:r>
+        <w:t xml:space="preserve">1 557 lignes, et celle des coordonnées de contact des acquéreurs et de leurs co-acquéreurs,</w:t>
+      </w:r>
+      <w:r>
+        <w:t xml:space="preserve"> </w:t>
+      </w:r>
+      <w:r>
+        <w:t xml:space="preserve">qui en porte 1 602. Le périmètre de travail ainsi constitué compte</w:t>
+      </w:r>
+      <w:r>
+        <w:t xml:space="preserve"> </w:t>
+      </w:r>
+      <w:r>
+        <w:rPr>
+          <w:bCs/>
+          <w:b/>
+        </w:rPr>
+        <w:t xml:space="preserve">1 602 lignes</w:t>
+      </w:r>
+      <w:r>
+        <w:t xml:space="preserve">, et</w:t>
+      </w:r>
+      <w:r>
+        <w:t xml:space="preserve"> </w:t>
+      </w:r>
+      <w:r>
+        <w:t xml:space="preserve">c’est de ce total que part toute la chaîne de traitement.</w:t>
       </w:r>
     </w:p>
     <w:p>
@@ -461,13 +467,13 @@
         <w:pStyle w:val="BodyText"/>
       </w:pPr>
       <w:r>
-        <w:t xml:space="preserve">La difficulté n’était pas la volumétrie, qui reste modeste au regard des 283 opérations</w:t>
-      </w:r>
-      <w:r>
-        <w:t xml:space="preserve"> </w:t>
-      </w:r>
-      <w:r>
-        <w:t xml:space="preserve">traitées au premier semestre. Elle tenait à la nature même de la donnée. Concrètement, une</w:t>
+        <w:t xml:space="preserve">La difficulté ne tenait pas au volume, comparable à celui des 283 opérations du périmètre</w:t>
+      </w:r>
+      <w:r>
+        <w:t xml:space="preserve"> </w:t>
+      </w:r>
+      <w:r>
+        <w:t xml:space="preserve">de migration engagé au premier semestre. Elle tenait à la nature même de la donnée. Concrètement, une</w:t>
       </w:r>
       <w:r>
         <w:t xml:space="preserve"> </w:t>
@@ -573,19 +579,13 @@
         <w:t xml:space="preserve"> </w:t>
       </w:r>
       <w:r>
-        <w:t xml:space="preserve">13 000 tiers y avaient déjà été créés, soit par des saisies manuelles réalisées par les</w:t>
-      </w:r>
-      <w:r>
-        <w:t xml:space="preserve"> </w:t>
-      </w:r>
-      <w:r>
-        <w:t xml:space="preserve">équipes commerciales depuis le démarrage de l’outil, soit par d’autres canaux d’alimentation.</w:t>
-      </w:r>
-      <w:r>
-        <w:t xml:space="preserve"> </w:t>
-      </w:r>
-      <w:r>
-        <w:t xml:space="preserve">Injecter mes 1 602 lignes sans les confronter à cet existant aurait produit des doublons</w:t>
+        <w:t xml:space="preserve">13 000 tiers y avaient déjà été créés, par saisie ou par d’autres canaux d’alimentation.</w:t>
+      </w:r>
+      <w:r>
+        <w:t xml:space="preserve"> </w:t>
+      </w:r>
+      <w:r>
+        <w:t xml:space="preserve">Injecter ces 1 602 lignes sans les confronter à cet existant aurait produit des doublons</w:t>
       </w:r>
       <w:r>
         <w:t xml:space="preserve"> </w:t>
@@ -611,7 +611,7 @@
         <w:t xml:space="preserve"> </w:t>
       </w:r>
       <w:r>
-        <w:t xml:space="preserve">qu’un acquéreur n’existe ni ailleurs dans le fichier ni déjà dans un référentiel de 13 000</w:t>
+        <w:t xml:space="preserve">qu’un acquéreur n’existe ni ailleurs dans le fichier ni déjà dans un référentiel de 13 000</w:t>
       </w:r>
       <w:r>
         <w:t xml:space="preserve"> </w:t>
@@ -635,13 +635,13 @@
         <w:t xml:space="preserve"> </w:t>
       </w:r>
       <w:r>
-        <w:t xml:space="preserve">de manière à ce que la décision d’importer ou non une ligne soit calculée et non prise au</w:t>
-      </w:r>
-      <w:r>
-        <w:t xml:space="preserve"> </w:t>
-      </w:r>
-      <w:r>
-        <w:t xml:space="preserve">cas par cas.</w:t>
+        <w:t xml:space="preserve">de sorte que la décision d’importer ou non une ligne soit calculée et non prise au cas par</w:t>
+      </w:r>
+      <w:r>
+        <w:t xml:space="preserve"> </w:t>
+      </w:r>
+      <w:r>
+        <w:t xml:space="preserve">cas.</w:t>
       </w:r>
     </w:p>
     <w:bookmarkEnd w:id="21"/>
@@ -742,7 +742,7 @@
         <w:t xml:space="preserve"> </w:t>
       </w:r>
       <w:r>
-        <w:t xml:space="preserve">porte les 1 557 lignes de ventes reprises du CRM, la</w:t>
+        <w:t xml:space="preserve">porte les 1 557 lignes de ventes reprises du CRM, la</w:t>
       </w:r>
       <w:r>
         <w:t xml:space="preserve"> </w:t>
@@ -763,7 +763,7 @@
         <w:t xml:space="preserve"> </w:t>
       </w:r>
       <w:r>
-        <w:t xml:space="preserve">les 1 602 lignes de coordonnées des acquéreurs et</w:t>
+        <w:t xml:space="preserve">les 1 602 lignes de coordonnées des acquéreurs et</w:t>
       </w:r>
       <w:r>
         <w:t xml:space="preserve"> </w:t>
@@ -1226,7 +1226,13 @@
         <w:t xml:space="preserve"> </w:t>
       </w:r>
       <w:r>
-        <w:t xml:space="preserve">pour les tiers, les représentants, les adresses, les courriels, les téléphones et les rôles.</w:t>
+        <w:t xml:space="preserve">par objet rattaché. Six d’entre eux correspondent aux six feuilles de sortie de mon fichier,</w:t>
+      </w:r>
+      <w:r>
+        <w:t xml:space="preserve"> </w:t>
+      </w:r>
+      <w:r>
+        <w:t xml:space="preserve">les deux autres, les RIB et les sites web, n’étant pas alimentés par cette reprise.</w:t>
       </w:r>
     </w:p>
     <w:p>
@@ -1350,19 +1356,19 @@
         <w:t xml:space="preserve"> </w:t>
       </w:r>
       <w:r>
-        <w:t xml:space="preserve">lignes retenues vers les six feuilles de sortie. Ces trois mécanismes sont l’apport</w:t>
-      </w:r>
-      <w:r>
-        <w:t xml:space="preserve"> </w:t>
-      </w:r>
-      <w:r>
-        <w:t xml:space="preserve">méthodologique de ce travail, et ce sont eux qui font la différence entre un simple fichier</w:t>
-      </w:r>
-      <w:r>
-        <w:t xml:space="preserve"> </w:t>
-      </w:r>
-      <w:r>
-        <w:t xml:space="preserve">de mise en forme et un véritable outil de reprise.</w:t>
+        <w:t xml:space="preserve">lignes retenues vers les six feuilles de sortie. Ces trois mécanismes sont ce qui distingue</w:t>
+      </w:r>
+      <w:r>
+        <w:t xml:space="preserve"> </w:t>
+      </w:r>
+      <w:r>
+        <w:t xml:space="preserve">un fichier de mise en forme d’un outil de reprise, puisqu’ils déplacent la décision</w:t>
+      </w:r>
+      <w:r>
+        <w:t xml:space="preserve"> </w:t>
+      </w:r>
+      <w:r>
+        <w:t xml:space="preserve">d’importer une ligne de l’opérateur vers une règle écrite.</w:t>
       </w:r>
     </w:p>
     <w:bookmarkStart w:id="32" w:name="X25567ac3b9c165f27b3c00e936fcd14508ffd86"/>
@@ -1411,13 +1417,19 @@
         <w:t xml:space="preserve"> </w:t>
       </w:r>
       <w:r>
-        <w:t xml:space="preserve">porter des raisons sociales très proches sans être la même entité, alors que deux personnes</w:t>
-      </w:r>
-      <w:r>
-        <w:t xml:space="preserve"> </w:t>
-      </w:r>
-      <w:r>
-        <w:t xml:space="preserve">homonymes nées le même jour à la même adresse sont, en pratique, la même personne. J’ai</w:t>
+        <w:t xml:space="preserve">porter des raisons sociales très proches sans être la même entité, alors qu’il devient très</w:t>
+      </w:r>
+      <w:r>
+        <w:t xml:space="preserve"> </w:t>
+      </w:r>
+      <w:r>
+        <w:t xml:space="preserve">improbable que deux lignes partageant nom, prénom, date de naissance et adresse désignent</w:t>
+      </w:r>
+      <w:r>
+        <w:t xml:space="preserve"> </w:t>
+      </w:r>
+      <w:r>
+        <w:t xml:space="preserve">deux personnes distinctes. J’ai</w:t>
       </w:r>
       <w:r>
         <w:t xml:space="preserve"> </w:t>
@@ -1464,19 +1476,19 @@
         <w:t xml:space="preserve"> </w:t>
       </w:r>
       <w:r>
-        <w:t xml:space="preserve">: le nom et le prénom de l’acquéreur principal du dossier de vente,</w:t>
-      </w:r>
-      <w:r>
-        <w:t xml:space="preserve"> </w:t>
-      </w:r>
-      <w:r>
-        <w:t xml:space="preserve">désigné ADV dans nos extractions, complétés du nom et du prénom du co-acquéreur, désigné</w:t>
-      </w:r>
-      <w:r>
-        <w:t xml:space="preserve"> </w:t>
-      </w:r>
-      <w:r>
-        <w:t xml:space="preserve">CO. C’est la combinaison des deux identités qui fait l’unicité, et non chacune prise</w:t>
+        <w:t xml:space="preserve">: le nom et le prénom de l’acquéreur principal, désigné ADV dans nos</w:t>
+      </w:r>
+      <w:r>
+        <w:t xml:space="preserve"> </w:t>
+      </w:r>
+      <w:r>
+        <w:t xml:space="preserve">extractions du nom du dossier de vente auquel il est rattaché, complétés du nom et du</w:t>
+      </w:r>
+      <w:r>
+        <w:t xml:space="preserve"> </w:t>
+      </w:r>
+      <w:r>
+        <w:t xml:space="preserve">prénom du co-acquéreur, désigné CO. C’est la combinaison des deux identités qui fait l’unicité, et non chacune prise</w:t>
       </w:r>
       <w:r>
         <w:t xml:space="preserve"> </w:t>
@@ -1510,13 +1522,13 @@
         <w:t xml:space="preserve"> </w:t>
       </w:r>
       <w:r>
-        <w:t xml:space="preserve">La date de naissance sépare les homonymes ; l’adresse ajoute une sécurité pour les cas</w:t>
-      </w:r>
-      <w:r>
-        <w:t xml:space="preserve"> </w:t>
-      </w:r>
-      <w:r>
-        <w:t xml:space="preserve">où elle n’est pas renseignée de façon fiable.</w:t>
+        <w:t xml:space="preserve">La date de naissance sépare les homonymes, et l’adresse ajoute un second point de</w:t>
+      </w:r>
+      <w:r>
+        <w:t xml:space="preserve"> </w:t>
+      </w:r>
+      <w:r>
+        <w:t xml:space="preserve">comparaison.</w:t>
       </w:r>
     </w:p>
     <w:p>
@@ -1544,13 +1556,7 @@
         <w:t xml:space="preserve"> </w:t>
       </w:r>
       <w:r>
-        <w:t xml:space="preserve">légal, il suffirait seul, mais il n’est pas toujours renseigné dans les données</w:t>
-      </w:r>
-      <w:r>
-        <w:t xml:space="preserve"> </w:t>
-      </w:r>
-      <w:r>
-        <w:t xml:space="preserve">historiques : la raison sociale prend alors le relais.</w:t>
+        <w:t xml:space="preserve">légal de l’établissement, et la raison sociale le double lorsqu’il fait défaut.</w:t>
       </w:r>
     </w:p>
     <w:p>
@@ -1854,7 +1860,7 @@
         <w:t xml:space="preserve"> </w:t>
       </w:r>
       <w:r>
-        <w:t xml:space="preserve">détectés comme déjà existants et écartés. Rapporté aux 1 474 tiers uniques, le volume peut</w:t>
+        <w:t xml:space="preserve">détectés comme déjà existants et écartés. Rapporté aux 1 474 tiers uniques, le volume peut</w:t>
       </w:r>
       <w:r>
         <w:t xml:space="preserve"> </w:t>
@@ -1874,19 +1880,19 @@
         <w:pStyle w:val="BodyText"/>
       </w:pPr>
       <w:r>
-        <w:t xml:space="preserve">La Figure 1.3 récapitule l’effet cumulé de ces deux premiers mécanismes. Des 1 602 lignes</w:t>
-      </w:r>
-      <w:r>
-        <w:t xml:space="preserve"> </w:t>
-      </w:r>
-      <w:r>
-        <w:t xml:space="preserve">brutes issues de Vadimm, la déduplication interne en écarte 128 qui correspondent à des</w:t>
-      </w:r>
-      <w:r>
-        <w:t xml:space="preserve"> </w:t>
-      </w:r>
-      <w:r>
-        <w:t xml:space="preserve">achats répétés, ramenant le total à 1 474 tiers uniques ; l’exclusion des tiers déjà présents</w:t>
+        <w:t xml:space="preserve">La Figure 1.3 récapitule l’effet cumulé de ces deux premiers mécanismes. Des 1 602 lignes</w:t>
+      </w:r>
+      <w:r>
+        <w:t xml:space="preserve"> </w:t>
+      </w:r>
+      <w:r>
+        <w:t xml:space="preserve">du périmètre de départ, la déduplication interne en écarte 128 qui correspondent à des</w:t>
+      </w:r>
+      <w:r>
+        <w:t xml:space="preserve"> </w:t>
+      </w:r>
+      <w:r>
+        <w:t xml:space="preserve">achats répétés, ramenant le total à 1 474 tiers uniques ; l’exclusion des tiers déjà présents</w:t>
       </w:r>
       <w:r>
         <w:t xml:space="preserve"> </w:t>
@@ -1902,7 +1908,7 @@
           <w:bCs/>
           <w:b/>
         </w:rPr>
-        <w:t xml:space="preserve">1 434 tiers à créer</w:t>
+        <w:t xml:space="preserve">1 434 tiers à créer</w:t>
       </w:r>
       <w:r>
         <w:t xml:space="preserve">. Chaque étage de</w:t>
@@ -1927,9 +1933,9 @@
       <w:r>
         <w:drawing>
           <wp:inline>
-            <wp:extent cx="4907280" cy="1896045"/>
+            <wp:extent cx="4907280" cy="1850357"/>
             <wp:effectExtent b="0" l="0" r="0" t="0"/>
-            <wp:docPr descr="De 1 602 lignes brutes à 1 434 tiers créés : l’effet des deux filtres successifs" title="" id="34" name="Picture"/>
+            <wp:docPr descr="De 1 602 lignes de départ à 1 434 tiers créés : l’effet des deux filtres successifs" title="" id="34" name="Picture"/>
             <a:graphic>
               <a:graphicData uri="http://schemas.openxmlformats.org/drawingml/2006/picture">
                 <pic:pic>
@@ -1948,7 +1954,7 @@
                   <pic:spPr bwMode="auto">
                     <a:xfrm>
                       <a:off x="0" y="0"/>
-                      <a:ext cx="4907280" cy="1896045"/>
+                      <a:ext cx="4907280" cy="1850357"/>
                     </a:xfrm>
                     <a:prstGeom prst="rect">
                       <a:avLst/>
@@ -1972,7 +1978,7 @@
         <w:pStyle w:val="ImageCaption"/>
       </w:pPr>
       <w:r>
-        <w:t xml:space="preserve">Figure 1.3 – De 1 602 lignes brutes à 1 434 tiers créés : l’effet des deux filtres successifs</w:t>
+        <w:t xml:space="preserve">Figure 1.3 – De 1 602 lignes de départ à 1 434 tiers créés : l’effet des deux filtres successifs</w:t>
       </w:r>
     </w:p>
     <w:bookmarkEnd w:id="36"/>
@@ -2008,13 +2014,13 @@
         <w:t xml:space="preserve"> </w:t>
       </w:r>
       <w:r>
-        <w:t xml:space="preserve">concerne que les personnes physiques et morales, celle des courriels seulement celles dont</w:t>
-      </w:r>
-      <w:r>
-        <w:t xml:space="preserve"> </w:t>
-      </w:r>
-      <w:r>
-        <w:t xml:space="preserve">le courriel est renseigné, et celle des représentants deux lignes par couple plus une par</w:t>
+        <w:t xml:space="preserve">concerne que les personnes physiques et morales, celle des courriels seulement celles de</w:t>
+      </w:r>
+      <w:r>
+        <w:t xml:space="preserve"> </w:t>
+      </w:r>
+      <w:r>
+        <w:t xml:space="preserve">ces personnes dont le courriel est renseigné, et celle des représentants deux lignes par couple plus une par</w:t>
       </w:r>
       <w:r>
         <w:t xml:space="preserve"> </w:t>
@@ -2191,13 +2197,13 @@
         <w:t xml:space="preserve"> </w:t>
       </w:r>
       <w:r>
-        <w:t xml:space="preserve">y lit directement le modèle de données décrit plus haut : 1 434 lignes pour la liste</w:t>
-      </w:r>
-      <w:r>
-        <w:t xml:space="preserve"> </w:t>
-      </w:r>
-      <w:r>
-        <w:t xml:space="preserve">maîtresse des tiers et autant pour l’attribution du rôle « Client », mais 1 871 lignes de</w:t>
+        <w:t xml:space="preserve">y lit directement le modèle de données décrit plus haut : 1 434 lignes pour la liste</w:t>
+      </w:r>
+      <w:r>
+        <w:t xml:space="preserve"> </w:t>
+      </w:r>
+      <w:r>
+        <w:t xml:space="preserve">maîtresse des tiers et autant pour l’attribution du rôle « Client », mais 1 871 lignes de</w:t>
       </w:r>
       <w:r>
         <w:t xml:space="preserve"> </w:t>
@@ -2215,7 +2221,13 @@
         <w:t xml:space="preserve"> </w:t>
       </w:r>
       <w:r>
-        <w:t xml:space="preserve">physiques et morales.</w:t>
+        <w:t xml:space="preserve">physiques et morales. Ces écarts de volumétrie d’un fichier à l’autre ne sont donc pas des</w:t>
+      </w:r>
+      <w:r>
+        <w:t xml:space="preserve"> </w:t>
+      </w:r>
+      <w:r>
+        <w:t xml:space="preserve">approximations : ils sont la traduction directe du modèle de données décrit en 1.2.2.</w:t>
       </w:r>
     </w:p>
     <w:p>
@@ -2332,35 +2344,35 @@
           <w:bCs/>
           <w:b/>
         </w:rPr>
-        <w:t xml:space="preserve">rangs de déduplication avec des valeurs 1 et 2 visibles, une ligne portant un code SPO dans</w:t>
-      </w:r>
-      <w:r>
-        <w:rPr>
-          <w:bCs/>
-          <w:b/>
-        </w:rPr>
-        <w:t xml:space="preserve"> </w:t>
-      </w:r>
-      <w:r>
-        <w:rPr>
-          <w:bCs/>
-          <w:b/>
-        </w:rPr>
-        <w:t xml:space="preserve">les colonnes de matching, et le panneau de contrôle avec ses compteurs. À insérer ici, avec</w:t>
-      </w:r>
-      <w:r>
-        <w:rPr>
-          <w:bCs/>
-          <w:b/>
-        </w:rPr>
-        <w:t xml:space="preserve"> </w:t>
-      </w:r>
-      <w:r>
-        <w:rPr>
-          <w:bCs/>
-          <w:b/>
-        </w:rPr>
-        <w:t xml:space="preserve">renumérotation des figures suivantes.]</w:t>
+        <w:t xml:space="preserve">rangs de déduplication avec des valeurs 1 et 2 visibles, et une ligne portant un code SPO</w:t>
+      </w:r>
+      <w:r>
+        <w:rPr>
+          <w:bCs/>
+          <w:b/>
+        </w:rPr>
+        <w:t xml:space="preserve"> </w:t>
+      </w:r>
+      <w:r>
+        <w:rPr>
+          <w:bCs/>
+          <w:b/>
+        </w:rPr>
+        <w:t xml:space="preserve">dans les colonnes de rapprochement. À insérer ici, avec renumérotation des figures</w:t>
+      </w:r>
+      <w:r>
+        <w:rPr>
+          <w:bCs/>
+          <w:b/>
+        </w:rPr>
+        <w:t xml:space="preserve"> </w:t>
+      </w:r>
+      <w:r>
+        <w:rPr>
+          <w:bCs/>
+          <w:b/>
+        </w:rPr>
+        <w:t xml:space="preserve">suivantes.]</w:t>
       </w:r>
     </w:p>
     <w:bookmarkEnd w:id="40"/>
@@ -2400,13 +2412,13 @@
         <w:t xml:space="preserve"> </w:t>
       </w:r>
       <w:r>
-        <w:t xml:space="preserve">plusieurs contraintes de format qu’aucune documentation ne mentionnait et que j’ai</w:t>
-      </w:r>
-      <w:r>
-        <w:t xml:space="preserve"> </w:t>
-      </w:r>
-      <w:r>
-        <w:t xml:space="preserve">découvertes par rejets successifs.</w:t>
+        <w:t xml:space="preserve">plusieurs contraintes de format que la documentation ne mentionnait pas et que les premiers</w:t>
+      </w:r>
+      <w:r>
+        <w:t xml:space="preserve"> </w:t>
+      </w:r>
+      <w:r>
+        <w:t xml:space="preserve">rejets ont fait apparaître.</w:t>
       </w:r>
     </w:p>
     <w:p>
@@ -2450,19 +2462,13 @@
         <w:t xml:space="preserve"> </w:t>
       </w:r>
       <w:r>
-        <w:t xml:space="preserve">caractère) encodé en UTF-8, avec le point-virgule comme séparateur. C’est la</w:t>
-      </w:r>
-      <w:r>
-        <w:t xml:space="preserve"> </w:t>
-      </w:r>
-      <w:r>
-        <w:t xml:space="preserve">configuration attendue par l’outil d’import ; toute autre combinaison produit un fichier</w:t>
-      </w:r>
-      <w:r>
-        <w:t xml:space="preserve"> </w:t>
-      </w:r>
-      <w:r>
-        <w:t xml:space="preserve">lu comme une colonne unique.</w:t>
+        <w:t xml:space="preserve">caractère) encodé en UTF-8, avec le point-virgule comme séparateur. C’est la seule</w:t>
+      </w:r>
+      <w:r>
+        <w:t xml:space="preserve"> </w:t>
+      </w:r>
+      <w:r>
+        <w:t xml:space="preserve">configuration acceptée par l’outil d’import.</w:t>
       </w:r>
     </w:p>
     <w:p>
@@ -2588,7 +2594,7 @@
         <w:t xml:space="preserve"> </w:t>
       </w:r>
       <w:r>
-        <w:t xml:space="preserve">et c’est elle qui explique que l’import des couples se soit fait en cinq lots successifs.</w:t>
+        <w:t xml:space="preserve">et c’est elle qui explique que l’import des couples s’est fait en cinq lots successifs.</w:t>
       </w:r>
     </w:p>
     <w:p>
@@ -2700,7 +2706,7 @@
         <w:t xml:space="preserve"> </w:t>
       </w:r>
       <w:r>
-        <w:t xml:space="preserve">et les représentants, mais laissaient les coordonnées de contact vides. Concrètement,</w:t>
+        <w:t xml:space="preserve">et les représentants, mais ne pouvaient pas porter les coordonnées de contact. Concrètement,</w:t>
       </w:r>
       <w:r>
         <w:t xml:space="preserve"> </w:t>
@@ -2726,7 +2732,7 @@
         <w:pStyle w:val="BodyText"/>
       </w:pPr>
       <w:r>
-        <w:t xml:space="preserve">Trois options s’offraient à moi. La première, saisir ces coordonnées à la main après</w:t>
+        <w:t xml:space="preserve">Deux voies restaient praticables. La première, saisir ces coordonnées à la main après</w:t>
       </w:r>
       <w:r>
         <w:t xml:space="preserve"> </w:t>
@@ -2738,25 +2744,19 @@
         <w:t xml:space="preserve"> </w:t>
       </w:r>
       <w:r>
-        <w:t xml:space="preserve">d’erreur que le fichier automatisé visait à supprimer. La deuxième, demander à l’éditeur</w:t>
-      </w:r>
-      <w:r>
-        <w:t xml:space="preserve"> </w:t>
-      </w:r>
-      <w:r>
-        <w:t xml:space="preserve">une évolution du format d’import, était sans rapport avec les délais du projet. La</w:t>
-      </w:r>
-      <w:r>
-        <w:t xml:space="preserve"> </w:t>
-      </w:r>
-      <w:r>
-        <w:t xml:space="preserve">troisième consistait à passer par l’API de SPO, que j’avais déjà pratiquée pour la reprise</w:t>
-      </w:r>
-      <w:r>
-        <w:t xml:space="preserve"> </w:t>
-      </w:r>
-      <w:r>
-        <w:t xml:space="preserve">des budgets au premier semestre. C’est celle que j’ai retenue.</w:t>
+        <w:t xml:space="preserve">d’erreur que le fichier automatisé visait à supprimer. La seconde consistait à passer par</w:t>
+      </w:r>
+      <w:r>
+        <w:t xml:space="preserve"> </w:t>
+      </w:r>
+      <w:r>
+        <w:t xml:space="preserve">l’API de SPO, que j’avais déjà pratiquée au premier semestre. C’est celle que j’ai</w:t>
+      </w:r>
+      <w:r>
+        <w:t xml:space="preserve"> </w:t>
+      </w:r>
+      <w:r>
+        <w:t xml:space="preserve">retenue.</w:t>
       </w:r>
     </w:p>
     <w:p>
@@ -2855,7 +2855,19 @@
         <w:t xml:space="preserve"> </w:t>
       </w:r>
       <w:r>
-        <w:t xml:space="preserve">de chaque requête à partir des coordonnées présentes dans la feuille des coordonnées.</w:t>
+        <w:t xml:space="preserve">de chaque requête à partir des données présentes dans la feuille</w:t>
+      </w:r>
+      <w:r>
+        <w:t xml:space="preserve"> </w:t>
+      </w:r>
+      <w:r>
+        <w:rPr>
+          <w:rStyle w:val="VerbatimChar"/>
+        </w:rPr>
+        <w:t xml:space="preserve">Builder coordonnée</w:t>
+      </w:r>
+      <w:r>
+        <w:t xml:space="preserve">.</w:t>
       </w:r>
     </w:p>
     <w:p>
@@ -2883,13 +2895,7 @@
         <w:t xml:space="preserve"> </w:t>
       </w:r>
       <w:r>
-        <w:t xml:space="preserve">Postman, l’outil de test et d’exécution de requêtes que j’utilisais déjà pour mes</w:t>
-      </w:r>
-      <w:r>
-        <w:t xml:space="preserve"> </w:t>
-      </w:r>
-      <w:r>
-        <w:t xml:space="preserve">essais unitaires. La collection compte</w:t>
+        <w:t xml:space="preserve">Postman, l’outil de test et d’exécution de requêtes. La collection compte</w:t>
       </w:r>
       <w:r>
         <w:t xml:space="preserve"> </w:t>
@@ -2902,19 +2908,13 @@
         <w:t xml:space="preserve">872 requêtes PATCH</w:t>
       </w:r>
       <w:r>
-        <w:t xml:space="preserve">, organisées en cinq lots</w:t>
-      </w:r>
-      <w:r>
-        <w:t xml:space="preserve"> </w:t>
-      </w:r>
-      <w:r>
-        <w:t xml:space="preserve">correspondant aux cinq fichiers d’import de couples, afin que l’ordre d’exécution suive</w:t>
-      </w:r>
-      <w:r>
-        <w:t xml:space="preserve"> </w:t>
-      </w:r>
-      <w:r>
-        <w:t xml:space="preserve">exactement l’ordre de création.</w:t>
+        <w:t xml:space="preserve">, organisées en cinq lots correspondant aux cinq fichiers d’import</w:t>
+      </w:r>
+      <w:r>
+        <w:t xml:space="preserve"> </w:t>
+      </w:r>
+      <w:r>
+        <w:t xml:space="preserve">de couples.</w:t>
       </w:r>
     </w:p>
     <w:p>
@@ -3057,13 +3057,13 @@
         <w:t xml:space="preserve"> </w:t>
       </w:r>
       <w:r>
-        <w:t xml:space="preserve">retomber dans la saisie manuelle, est une compétence que ce projet m’a fait acquérir bien</w:t>
-      </w:r>
-      <w:r>
-        <w:t xml:space="preserve"> </w:t>
-      </w:r>
-      <w:r>
-        <w:t xml:space="preserve">plus que la précédente reprise.</w:t>
+        <w:t xml:space="preserve">retomber dans la saisie manuelle, est une compétence que la reprise du premier semestre</w:t>
+      </w:r>
+      <w:r>
+        <w:t xml:space="preserve"> </w:t>
+      </w:r>
+      <w:r>
+        <w:t xml:space="preserve">n’avait pas eu l’occasion de mobiliser.</w:t>
       </w:r>
     </w:p>
     <w:bookmarkEnd w:id="43"/>
@@ -3318,7 +3318,7 @@
         <w:pStyle w:val="BodyText"/>
       </w:pPr>
       <w:r>
-        <w:t xml:space="preserve">Ces cas sont peu nombreux au regard des 1 434 tiers créés, et il serait tentant de les</w:t>
+        <w:t xml:space="preserve">Ces cas sont peu nombreux au regard des 1 434 tiers créés, et il serait tentant de les</w:t>
       </w:r>
       <w:r>
         <w:t xml:space="preserve"> </w:t>
@@ -3348,7 +3348,7 @@
         <w:t xml:space="preserve"> </w:t>
       </w:r>
       <w:r>
-        <w:t xml:space="preserve">l’avoir concentrée sur une poignée de cas identifiés, au lieu de la diluer sur 1 602 lignes.</w:t>
+        <w:t xml:space="preserve">l’avoir concentrée sur une poignée de cas identifiés, au lieu de la diluer sur 1 602 lignes.</w:t>
       </w:r>
     </w:p>
     <w:bookmarkEnd w:id="45"/>
@@ -3378,14 +3378,14 @@
     <w:tbl>
       <w:tblPr>
         <w:tblStyle w:val="Table"/>
-        <w:tblW w:type="auto" w:w="0"/>
+        <w:tblW w:type="pct" w:w="5000"/>
         <w:tblLook w:firstRow="1" w:lastRow="0" w:firstColumn="0" w:lastColumn="0" w:noHBand="0" w:noVBand="0" w:val="0020"/>
         <w:jc w:val="start"/>
       </w:tblPr>
       <w:tblGrid>
-        <w:gridCol w:w="2640"/>
-        <w:gridCol w:w="2640"/>
-        <w:gridCol w:w="2640"/>
+        <w:gridCol w:w="4800"/>
+        <w:gridCol w:w="960"/>
+        <w:gridCol w:w="2160"/>
       </w:tblGrid>
       <w:tr>
         <w:trPr>
@@ -3449,7 +3449,7 @@
               <w:jc w:val="right"/>
             </w:pPr>
             <w:r>
-              <w:t xml:space="preserve">1 434</w:t>
+              <w:t xml:space="preserve">1 434</w:t>
             </w:r>
           </w:p>
         </w:tc>
@@ -3601,7 +3601,7 @@
               <w:jc w:val="right"/>
             </w:pPr>
             <w:r>
-              <w:t xml:space="preserve">1 871</w:t>
+              <w:t xml:space="preserve">1 871</w:t>
             </w:r>
           </w:p>
         </w:tc>
@@ -3639,7 +3639,7 @@
               <w:jc w:val="right"/>
             </w:pPr>
             <w:r>
-              <w:t xml:space="preserve">1 434</w:t>
+              <w:t xml:space="preserve">1 434</w:t>
             </w:r>
           </w:p>
         </w:tc>
@@ -3677,7 +3677,7 @@
               <w:jc w:val="right"/>
             </w:pPr>
             <w:r>
-              <w:t xml:space="preserve">872</w:t>
+              <w:t xml:space="preserve">872 requêtes</w:t>
             </w:r>
           </w:p>
         </w:tc>
@@ -3700,7 +3700,7 @@
         <w:pStyle w:val="BodyText"/>
       </w:pPr>
       <w:r>
-        <w:t xml:space="preserve">Les 1 434 tiers créés se répartissent en</w:t>
+        <w:t xml:space="preserve">Les 1 434 tiers créés se répartissent en</w:t>
       </w:r>
       <w:r>
         <w:t xml:space="preserve"> </w:t>
@@ -3772,7 +3772,7 @@
           <wp:inline>
             <wp:extent cx="4907280" cy="1972057"/>
             <wp:effectExtent b="0" l="0" r="0" t="0"/>
-            <wp:docPr descr="Répartition des 1 434 tiers créés selon leur nature" title="" id="47" name="Picture"/>
+            <wp:docPr descr="Répartition des 1 434 tiers créés selon leur nature" title="" id="47" name="Picture"/>
             <a:graphic>
               <a:graphicData uri="http://schemas.openxmlformats.org/drawingml/2006/picture">
                 <pic:pic>
@@ -3815,7 +3815,7 @@
         <w:pStyle w:val="ImageCaption"/>
       </w:pPr>
       <w:r>
-        <w:t xml:space="preserve">Figure 1.5 – Répartition des 1 434 tiers créés selon leur nature</w:t>
+        <w:t xml:space="preserve">Figure 1.5 – Répartition des 1 434 tiers créés selon leur nature</w:t>
       </w:r>
     </w:p>
     <w:p>
@@ -3877,7 +3877,7 @@
         <w:pStyle w:val="BodyText"/>
       </w:pPr>
       <w:r>
-        <w:t xml:space="preserve">Le premier concerne l’usage du fichier lui-même. Trois manipulations le cassent</w:t>
+        <w:t xml:space="preserve">Le premier concerne l’usage du fichier lui-même. Quatre manipulations le cassent</w:t>
       </w:r>
       <w:r>
         <w:t xml:space="preserve"> </w:t>
@@ -3889,31 +3889,37 @@
         <w:t xml:space="preserve"> </w:t>
       </w:r>
       <w:r>
-        <w:t xml:space="preserve">recalcul ; insérer une ligne au milieu de la feuille pivot ou de la feuille de coordonnées,</w:t>
-      </w:r>
-      <w:r>
-        <w:t xml:space="preserve"> </w:t>
-      </w:r>
-      <w:r>
-        <w:t xml:space="preserve">ce qui décale toutes les références ; et trier la feuille pivot, ce qui détruit la logique</w:t>
-      </w:r>
-      <w:r>
-        <w:t xml:space="preserve"> </w:t>
-      </w:r>
-      <w:r>
-        <w:t xml:space="preserve">de rang, celle-ci étant calculée de façon cumulative sur l’ordre des lignes. Aucune de ces</w:t>
-      </w:r>
-      <w:r>
-        <w:t xml:space="preserve"> </w:t>
-      </w:r>
-      <w:r>
-        <w:t xml:space="preserve">trois manipulations ne produit de message d’erreur, les rendant d’autant plus</w:t>
-      </w:r>
-      <w:r>
-        <w:t xml:space="preserve"> </w:t>
-      </w:r>
-      <w:r>
-        <w:t xml:space="preserve">dangereuses. C’est la raison pour laquelle la note de procédure les mentionne avant même</w:t>
+        <w:t xml:space="preserve">recalcul ; modifier les colonnes calculées de la feuille pivot, qui portent toute la logique</w:t>
+      </w:r>
+      <w:r>
+        <w:t xml:space="preserve"> </w:t>
+      </w:r>
+      <w:r>
+        <w:t xml:space="preserve">de rang et de numérotation ; insérer une ligne au milieu de la feuille pivot ou de la</w:t>
+      </w:r>
+      <w:r>
+        <w:t xml:space="preserve"> </w:t>
+      </w:r>
+      <w:r>
+        <w:t xml:space="preserve">feuille de coordonnées, ce qui décale toutes les références ; et trier la feuille pivot, ce</w:t>
+      </w:r>
+      <w:r>
+        <w:t xml:space="preserve"> </w:t>
+      </w:r>
+      <w:r>
+        <w:t xml:space="preserve">qui détruit la logique de rang, celle-ci étant calculée de façon cumulative sur l’ordre des</w:t>
+      </w:r>
+      <w:r>
+        <w:t xml:space="preserve"> </w:t>
+      </w:r>
+      <w:r>
+        <w:t xml:space="preserve">lignes. Aucune de ces quatre manipulations ne produit de message d’erreur, les rendant</w:t>
+      </w:r>
+      <w:r>
+        <w:t xml:space="preserve"> </w:t>
+      </w:r>
+      <w:r>
+        <w:t xml:space="preserve">d’autant plus dangereuses. C’est la raison pour laquelle la note de procédure les mentionne avant même</w:t>
       </w:r>
       <w:r>
         <w:t xml:space="preserve"> </w:t>
@@ -4157,7 +4163,7 @@
         <w:pStyle w:val="BodyText"/>
       </w:pPr>
       <w:r>
-        <w:t xml:space="preserve">Un dernier point de vigilance relève de la performance. Le fichier comporte environ 60 000</w:t>
+        <w:t xml:space="preserve">Un dernier point de vigilance relève de la performance. Le fichier comporte environ 60 000</w:t>
       </w:r>
       <w:r>
         <w:t xml:space="preserve"> </w:t>
@@ -4200,13 +4206,13 @@
         <w:t xml:space="preserve"> </w:t>
       </w:r>
       <w:r>
-        <w:t xml:space="preserve">du socle de données du nouvel ERP. Après les opérations, les tranches et les budgets migrés</w:t>
-      </w:r>
-      <w:r>
-        <w:t xml:space="preserve"> </w:t>
-      </w:r>
-      <w:r>
-        <w:t xml:space="preserve">au premier semestre, les 1 434 clients acquéreurs disposent désormais dans SPO d’une fiche</w:t>
+        <w:t xml:space="preserve">du socle de données du nouvel ERP. Après les opérations et leurs tranches migrées au</w:t>
+      </w:r>
+      <w:r>
+        <w:t xml:space="preserve"> </w:t>
+      </w:r>
+      <w:r>
+        <w:t xml:space="preserve">premier semestre, les 1 434 clients acquéreurs disposent désormais dans SPO d’une fiche</w:t>
       </w:r>
       <w:r>
         <w:t xml:space="preserve"> </w:t>
@@ -4256,13 +4262,13 @@
         <w:t xml:space="preserve"> </w:t>
       </w:r>
       <w:r>
-        <w:t xml:space="preserve">créés dans l’ERP par les équipes commerciales. Cependant, la donnée client est désormais</w:t>
-      </w:r>
-      <w:r>
-        <w:t xml:space="preserve"> </w:t>
-      </w:r>
-      <w:r>
-        <w:t xml:space="preserve">fiable, et c’est ce qui compte pour la suite.</w:t>
+        <w:t xml:space="preserve">créés dans l’ERP par les équipes commerciales. Le référentiel client est en revanche</w:t>
+      </w:r>
+      <w:r>
+        <w:t xml:space="preserve"> </w:t>
+      </w:r>
+      <w:r>
+        <w:t xml:space="preserve">stabilisé, et c’est lui qui conditionne la suite.</w:t>
       </w:r>
     </w:p>
     <w:p>
@@ -4300,7 +4306,13 @@
         <w:t xml:space="preserve"> </w:t>
       </w:r>
       <w:r>
-        <w:t xml:space="preserve">celle qui l’a faite. Ce sont trois compétences d’ingénierie des données, et non de saisie.</w:t>
+        <w:t xml:space="preserve">celle qui l’a faite. Ces trois points relèvent de l’ingénierie des données plus que de la</w:t>
+      </w:r>
+      <w:r>
+        <w:t xml:space="preserve"> </w:t>
+      </w:r>
+      <w:r>
+        <w:t xml:space="preserve">saisie.</w:t>
       </w:r>
     </w:p>
     <w:p>

</xml_diff>

<commit_message>
Applique les corrections de l'audit d'ensemble
Corrige le lien de causalité que la transition du chapitre 1 avançait et
que le chapitre 2 dément, situe explicitement la reprise des tiers au
second semestre, rattache le chapitre 1 au chantier d'interopérabilité
ERP-CRM annoncé au mémoire de mi-parcours, recadre en ouverture du
chapitre 2 le périmètre annoncé six mois plus tôt, et réécrit la
clausule finale, qui reprenait presque mot pour mot celle du volume
antérieur.

Retire par ailleurs cinq affirmations hors périmètre, corrige la lecture
du coefficient de corrélation intraclasse et l'inexactitude sur
l'asymétrie, glose le score F1 et l'élasticité, et compose les trois
emplacements de capture en bloc détaché plutôt qu'en corps de texte.

Les recommandations qui touchent au sommaire imposé sont reportées dans
les notes plutôt qu'appliquées.

Co-Authored-By: Claude Opus 5 <noreply@anthropic.com>
Claude-Session: https://claude.ai/code/session_01Hs8PVJaTgyjq9e8Ud5Nqb9
</commit_message>
<xml_diff>
--- a/chapitre_1_migration_tiers_spo.docx
+++ b/chapitre_1_migration_tiers_spo.docx
@@ -266,19 +266,25 @@
         <w:t xml:space="preserve"> </w:t>
       </w:r>
       <w:r>
-        <w:t xml:space="preserve">notre CRM Vadimm vers le nouvel ERP du groupe, SPO. Cette mission prolonge</w:t>
-      </w:r>
-      <w:r>
-        <w:t xml:space="preserve"> </w:t>
-      </w:r>
-      <w:r>
-        <w:t xml:space="preserve">directement le chantier de migration exposé dans mon mémoire de mi-parcours, mais elle en</w:t>
-      </w:r>
-      <w:r>
-        <w:t xml:space="preserve"> </w:t>
-      </w:r>
-      <w:r>
-        <w:t xml:space="preserve">change la nature : il ne s’agissait plus d’injecter des structures de gestion, opérations,</w:t>
+        <w:t xml:space="preserve">notre CRM Vadimm vers le nouvel ERP du groupe, SPO. Cette mission, conduite au second</w:t>
+      </w:r>
+      <w:r>
+        <w:t xml:space="preserve"> </w:t>
+      </w:r>
+      <w:r>
+        <w:t xml:space="preserve">semestre, prolonge directement le chantier de migration exposé dans mon mémoire de</w:t>
+      </w:r>
+      <w:r>
+        <w:t xml:space="preserve"> </w:t>
+      </w:r>
+      <w:r>
+        <w:t xml:space="preserve">mi-parcours, et elle répond au chantier d’interopérabilité entre l’ERP et le CRM que j’y</w:t>
+      </w:r>
+      <w:r>
+        <w:t xml:space="preserve"> </w:t>
+      </w:r>
+      <w:r>
+        <w:t xml:space="preserve">annonçais. Elle en change toutefois la nature : il ne s’agissait plus d’injecter des structures de gestion, opérations,</w:t>
       </w:r>
       <w:r>
         <w:t xml:space="preserve"> </w:t>
@@ -467,13 +473,7 @@
         <w:pStyle w:val="BodyText"/>
       </w:pPr>
       <w:r>
-        <w:t xml:space="preserve">La difficulté ne tenait pas au volume, comparable à celui des 283 opérations du périmètre</w:t>
-      </w:r>
-      <w:r>
-        <w:t xml:space="preserve"> </w:t>
-      </w:r>
-      <w:r>
-        <w:t xml:space="preserve">de migration engagé au premier semestre. Elle tenait à la nature même de la donnée. Concrètement, une</w:t>
+        <w:t xml:space="preserve">La difficulté ne tenait pas au volume. Elle tenait à la nature même de la donnée. Concrètement, une</w:t>
       </w:r>
       <w:r>
         <w:t xml:space="preserve"> </w:t>
@@ -2287,92 +2287,56 @@
     </w:p>
     <w:p>
       <w:pPr>
-        <w:pStyle w:val="BodyText"/>
+        <w:pStyle w:val="BlockText"/>
       </w:pPr>
       <w:r>
         <w:rPr>
           <w:bCs/>
           <w:b/>
         </w:rPr>
-        <w:t xml:space="preserve">[Emplacement réservé pour une figure — capture d’écran de la feuille</w:t>
-      </w:r>
-      <w:r>
-        <w:rPr>
-          <w:bCs/>
-          <w:b/>
-        </w:rPr>
+        <w:t xml:space="preserve">À insérer — figure.</w:t>
+      </w:r>
+      <w:r>
+        <w:t xml:space="preserve"> </w:t>
+      </w:r>
+      <w:r>
+        <w:t xml:space="preserve">Capture d’écran de la feuille</w:t>
+      </w:r>
+      <w:r>
         <w:t xml:space="preserve"> </w:t>
       </w:r>
       <w:r>
         <w:rPr>
           <w:rStyle w:val="VerbatimChar"/>
-          <w:bCs/>
-          <w:b/>
         </w:rPr>
         <w:t xml:space="preserve">BuilderTiers</w:t>
       </w:r>
       <w:r>
-        <w:rPr>
-          <w:bCs/>
-          <w:b/>
-        </w:rPr>
-        <w:t xml:space="preserve">,</w:t>
-      </w:r>
-      <w:r>
-        <w:rPr>
-          <w:bCs/>
-          <w:b/>
-        </w:rPr>
-        <w:t xml:space="preserve"> </w:t>
-      </w:r>
-      <w:r>
-        <w:rPr>
-          <w:bCs/>
-          <w:b/>
-        </w:rPr>
-        <w:t xml:space="preserve">montrant côte à côte les colonnes de données reprises et les colonnes calculées : les trois</w:t>
-      </w:r>
-      <w:r>
-        <w:rPr>
-          <w:bCs/>
-          <w:b/>
-        </w:rPr>
-        <w:t xml:space="preserve"> </w:t>
-      </w:r>
-      <w:r>
-        <w:rPr>
-          <w:bCs/>
-          <w:b/>
-        </w:rPr>
-        <w:t xml:space="preserve">rangs de déduplication avec des valeurs 1 et 2 visibles, et une ligne portant un code SPO</w:t>
-      </w:r>
-      <w:r>
-        <w:rPr>
-          <w:bCs/>
-          <w:b/>
-        </w:rPr>
-        <w:t xml:space="preserve"> </w:t>
-      </w:r>
-      <w:r>
-        <w:rPr>
-          <w:bCs/>
-          <w:b/>
-        </w:rPr>
-        <w:t xml:space="preserve">dans les colonnes de rapprochement. À insérer ici, avec renumérotation des figures</w:t>
-      </w:r>
-      <w:r>
-        <w:rPr>
-          <w:bCs/>
-          <w:b/>
-        </w:rPr>
-        <w:t xml:space="preserve"> </w:t>
-      </w:r>
-      <w:r>
-        <w:rPr>
-          <w:bCs/>
-          <w:b/>
-        </w:rPr>
-        <w:t xml:space="preserve">suivantes.]</w:t>
+        <w:t xml:space="preserve">, montrant côte à</w:t>
+      </w:r>
+      <w:r>
+        <w:t xml:space="preserve"> </w:t>
+      </w:r>
+      <w:r>
+        <w:t xml:space="preserve">côte les colonnes de données reprises et les colonnes calculées : les trois rangs de</w:t>
+      </w:r>
+      <w:r>
+        <w:t xml:space="preserve"> </w:t>
+      </w:r>
+      <w:r>
+        <w:t xml:space="preserve">déduplication avec des valeurs 1 et 2 visibles, et une ligne portant un code SPO dans les</w:t>
+      </w:r>
+      <w:r>
+        <w:t xml:space="preserve"> </w:t>
+      </w:r>
+      <w:r>
+        <w:t xml:space="preserve">colonnes de rapprochement. Anonymiser les noms d’acquéreurs. Les figures suivantes sont à</w:t>
+      </w:r>
+      <w:r>
+        <w:t xml:space="preserve"> </w:t>
+      </w:r>
+      <w:r>
+        <w:t xml:space="preserve">renuméroter après insertion.</w:t>
       </w:r>
     </w:p>
     <w:bookmarkEnd w:id="40"/>
@@ -2843,19 +2807,13 @@
         <w:t xml:space="preserve"> </w:t>
       </w:r>
       <w:r>
-        <w:t xml:space="preserve">J’ai construit dans le fichier de travail, par formules et</w:t>
-      </w:r>
-      <w:r>
-        <w:t xml:space="preserve"> </w:t>
-      </w:r>
-      <w:r>
-        <w:t xml:space="preserve">sur le même principe de numérotation séquentielle que les feuilles de sortie, le corps</w:t>
-      </w:r>
-      <w:r>
-        <w:t xml:space="preserve"> </w:t>
-      </w:r>
-      <w:r>
-        <w:t xml:space="preserve">de chaque requête à partir des données présentes dans la feuille</w:t>
+        <w:t xml:space="preserve">J’ai construit le corps de chaque requête à partir des</w:t>
+      </w:r>
+      <w:r>
+        <w:t xml:space="preserve"> </w:t>
+      </w:r>
+      <w:r>
+        <w:t xml:space="preserve">données présentes dans la feuille</w:t>
       </w:r>
       <w:r>
         <w:t xml:space="preserve"> </w:t>
@@ -2947,84 +2905,56 @@
     </w:p>
     <w:p>
       <w:pPr>
-        <w:pStyle w:val="FirstParagraph"/>
+        <w:pStyle w:val="BlockText"/>
       </w:pPr>
       <w:r>
         <w:rPr>
           <w:bCs/>
           <w:b/>
         </w:rPr>
-        <w:t xml:space="preserve">[Emplacement réservé pour une figure — capture d’écran de la collection Postman :</w:t>
-      </w:r>
-      <w:r>
-        <w:rPr>
-          <w:bCs/>
-          <w:b/>
-        </w:rPr>
-        <w:t xml:space="preserve"> </w:t>
-      </w:r>
-      <w:r>
-        <w:rPr>
-          <w:bCs/>
-          <w:b/>
-        </w:rPr>
-        <w:t xml:space="preserve">arborescence des cinq lots et vue d’une requête PATCH sur son onglet</w:t>
-      </w:r>
-      <w:r>
-        <w:rPr>
-          <w:bCs/>
-          <w:b/>
-        </w:rPr>
+        <w:t xml:space="preserve">À insérer — figure.</w:t>
+      </w:r>
+      <w:r>
+        <w:t xml:space="preserve"> </w:t>
+      </w:r>
+      <w:r>
+        <w:t xml:space="preserve">Capture d’écran de la collection Postman : arborescence des cinq</w:t>
+      </w:r>
+      <w:r>
+        <w:t xml:space="preserve"> </w:t>
+      </w:r>
+      <w:r>
+        <w:t xml:space="preserve">lots et vue d’une requête PATCH sur son onglet</w:t>
+      </w:r>
+      <w:r>
         <w:t xml:space="preserve"> </w:t>
       </w:r>
       <w:r>
         <w:rPr>
           <w:iCs/>
           <w:i/>
-          <w:bCs/>
-          <w:b/>
         </w:rPr>
         <w:t xml:space="preserve">Body</w:t>
       </w:r>
       <w:r>
-        <w:rPr>
-          <w:bCs/>
-          <w:b/>
-        </w:rPr>
-        <w:t xml:space="preserve">, montrant la</w:t>
-      </w:r>
-      <w:r>
-        <w:rPr>
-          <w:bCs/>
-          <w:b/>
-        </w:rPr>
-        <w:t xml:space="preserve"> </w:t>
-      </w:r>
-      <w:r>
-        <w:rPr>
-          <w:bCs/>
-          <w:b/>
-        </w:rPr>
-        <w:t xml:space="preserve">structure JSON Patch. Masquer l’adresse du serveur et les identifiants, comme sur la</w:t>
-      </w:r>
-      <w:r>
-        <w:rPr>
-          <w:bCs/>
-          <w:b/>
-        </w:rPr>
-        <w:t xml:space="preserve"> </w:t>
-      </w:r>
-      <w:r>
-        <w:rPr>
-          <w:bCs/>
-          <w:b/>
-        </w:rPr>
-        <w:t xml:space="preserve">Figure 1.2. À insérer ici, avec renumérotation des figures suivantes.]</w:t>
-      </w:r>
-    </w:p>
-    <w:p>
-      <w:pPr>
-        <w:pStyle w:val="BodyText"/>
+        <w:t xml:space="preserve">, montrant la structure JSON Patch.</w:t>
+      </w:r>
+      <w:r>
+        <w:t xml:space="preserve"> </w:t>
+      </w:r>
+      <w:r>
+        <w:t xml:space="preserve">Masquer l’adresse du serveur et les identifiants, comme sur la Figure 1.2. Les figures</w:t>
+      </w:r>
+      <w:r>
+        <w:t xml:space="preserve"> </w:t>
+      </w:r>
+      <w:r>
+        <w:t xml:space="preserve">suivantes sont à renuméroter après insertion.</w:t>
+      </w:r>
+    </w:p>
+    <w:p>
+      <w:pPr>
+        <w:pStyle w:val="FirstParagraph"/>
       </w:pPr>
       <w:r>
         <w:t xml:space="preserve">Ce contournement m’a appris quelque chose que je n’avais pas formulé aussi clairement</w:t>
@@ -3820,47 +3750,37 @@
     </w:p>
     <w:p>
       <w:pPr>
-        <w:pStyle w:val="BodyText"/>
+        <w:pStyle w:val="BlockText"/>
       </w:pPr>
       <w:r>
         <w:rPr>
           <w:bCs/>
           <w:b/>
         </w:rPr>
-        <w:t xml:space="preserve">[Emplacement réservé pour une figure — capture d’écran d’une fiche de couple dans SPO,</w:t>
-      </w:r>
-      <w:r>
-        <w:rPr>
-          <w:bCs/>
-          <w:b/>
-        </w:rPr>
-        <w:t xml:space="preserve"> </w:t>
-      </w:r>
-      <w:r>
-        <w:rPr>
-          <w:bCs/>
-          <w:b/>
-        </w:rPr>
-        <w:t xml:space="preserve">onglet des représentants ouvert, montrant les deux personnes du couple et les coordonnées</w:t>
-      </w:r>
-      <w:r>
-        <w:rPr>
-          <w:bCs/>
-          <w:b/>
-        </w:rPr>
-        <w:t xml:space="preserve"> </w:t>
-      </w:r>
-      <w:r>
-        <w:rPr>
-          <w:bCs/>
-          <w:b/>
-        </w:rPr>
-        <w:t xml:space="preserve">ajoutées par requête PATCH sur l’une d’elles. Anonymiser les noms. À insérer ici.]</w:t>
-      </w:r>
-    </w:p>
-    <w:p>
-      <w:pPr>
-        <w:pStyle w:val="BodyText"/>
+        <w:t xml:space="preserve">À insérer — figure.</w:t>
+      </w:r>
+      <w:r>
+        <w:t xml:space="preserve"> </w:t>
+      </w:r>
+      <w:r>
+        <w:t xml:space="preserve">Capture d’écran d’une fiche de couple dans SPO, onglet des</w:t>
+      </w:r>
+      <w:r>
+        <w:t xml:space="preserve"> </w:t>
+      </w:r>
+      <w:r>
+        <w:t xml:space="preserve">représentants ouvert, montrant les deux personnes du couple et les coordonnées ajoutées</w:t>
+      </w:r>
+      <w:r>
+        <w:t xml:space="preserve"> </w:t>
+      </w:r>
+      <w:r>
+        <w:t xml:space="preserve">par requête PATCH sur l’une d’elles. Anonymiser les noms.</w:t>
+      </w:r>
+    </w:p>
+    <w:p>
+      <w:pPr>
+        <w:pStyle w:val="FirstParagraph"/>
       </w:pPr>
       <w:r>
         <w:t xml:space="preserve">Au-delà du résultat, ce projet m’a laissé un ensemble de points de vigilance que j’ai</w:t>
@@ -4149,13 +4069,7 @@
         <w:t xml:space="preserve"> </w:t>
       </w:r>
       <w:r>
-        <w:t xml:space="preserve">d’aller plus loin. Ce panneau est le seul dispositif de détection dont je disposais, et il</w:t>
-      </w:r>
-      <w:r>
-        <w:t xml:space="preserve"> </w:t>
-      </w:r>
-      <w:r>
-        <w:t xml:space="preserve">a effectivement révélé plusieurs anomalies que rien d’autre n’aurait signalées.</w:t>
+        <w:t xml:space="preserve">d’aller plus loin. Ce panneau est le seul dispositif de détection dont je disposais.</w:t>
       </w:r>
     </w:p>
     <w:p>
@@ -4218,7 +4132,13 @@
         <w:t xml:space="preserve"> </w:t>
       </w:r>
       <w:r>
-        <w:t xml:space="preserve">unique, correctement typée, dotée de ses coordonnées, de ses représentants et de son rôle.</w:t>
+        <w:t xml:space="preserve">unique, correctement typée, dotée de ses représentants, de son rôle et, lorsque la source</w:t>
+      </w:r>
+      <w:r>
+        <w:t xml:space="preserve"> </w:t>
+      </w:r>
+      <w:r>
+        <w:t xml:space="preserve">les portait, de ses coordonnées.</w:t>
       </w:r>
       <w:r>
         <w:t xml:space="preserve"> </w:t>
@@ -4276,43 +4196,31 @@
         <w:pStyle w:val="BodyText"/>
       </w:pPr>
       <w:r>
-        <w:t xml:space="preserve">Ce chapitre aura montré, je l’espère, que la valeur de ce travail ne se mesure pas au</w:t>
-      </w:r>
-      <w:r>
-        <w:t xml:space="preserve"> </w:t>
-      </w:r>
-      <w:r>
-        <w:t xml:space="preserve">nombre de lignes importées. Elle tient d’abord au choix des trois clés d’unicité, qui</w:t>
-      </w:r>
-      <w:r>
-        <w:t xml:space="preserve"> </w:t>
-      </w:r>
-      <w:r>
-        <w:t xml:space="preserve">décide de ce qu’est un client dans notre référentiel ; ensuite à la capacité à contourner</w:t>
-      </w:r>
-      <w:r>
-        <w:t xml:space="preserve"> </w:t>
-      </w:r>
-      <w:r>
-        <w:t xml:space="preserve">une limite de format en changeant de porte d’entrée vers le système ; enfin à la</w:t>
-      </w:r>
-      <w:r>
-        <w:t xml:space="preserve"> </w:t>
-      </w:r>
-      <w:r>
-        <w:t xml:space="preserve">documentation des arbitrages, qui rend la reprise vérifiable par quelqu’un d’autre que</w:t>
-      </w:r>
-      <w:r>
-        <w:t xml:space="preserve"> </w:t>
-      </w:r>
-      <w:r>
-        <w:t xml:space="preserve">celle qui l’a faite. Ces trois points relèvent de l’ingénierie des données plus que de la</w:t>
-      </w:r>
-      <w:r>
-        <w:t xml:space="preserve"> </w:t>
-      </w:r>
-      <w:r>
-        <w:t xml:space="preserve">saisie.</w:t>
+        <w:t xml:space="preserve">La valeur de ce travail ne se mesure pas au nombre de lignes importées. Elle tient d’abord</w:t>
+      </w:r>
+      <w:r>
+        <w:t xml:space="preserve"> </w:t>
+      </w:r>
+      <w:r>
+        <w:t xml:space="preserve">au choix des trois clés d’unicité, qui décide de ce qu’est un client dans notre référentiel ;</w:t>
+      </w:r>
+      <w:r>
+        <w:t xml:space="preserve"> </w:t>
+      </w:r>
+      <w:r>
+        <w:t xml:space="preserve">ensuite à la capacité à contourner une limite de format en changeant de porte d’entrée vers</w:t>
+      </w:r>
+      <w:r>
+        <w:t xml:space="preserve"> </w:t>
+      </w:r>
+      <w:r>
+        <w:t xml:space="preserve">le système ; enfin à la documentation des arbitrages, qui rend la reprise vérifiable par</w:t>
+      </w:r>
+      <w:r>
+        <w:t xml:space="preserve"> </w:t>
+      </w:r>
+      <w:r>
+        <w:t xml:space="preserve">quelqu’un d’autre que celle qui l’a faite.</w:t>
       </w:r>
     </w:p>
     <w:p>
@@ -4344,13 +4252,13 @@
         <w:t xml:space="preserve"> </w:t>
       </w:r>
       <w:r>
-        <w:t xml:space="preserve">démontrer plutôt que de l’affirmer. Le chapitre suivant présente le projet que ce socle a</w:t>
-      </w:r>
-      <w:r>
-        <w:t xml:space="preserve"> </w:t>
-      </w:r>
-      <w:r>
-        <w:t xml:space="preserve">rendu possible : le Copilote Financier, un outil d’aide à la décision construit sur les</w:t>
+        <w:t xml:space="preserve">démontrer plutôt que de l’affirmer. Le chapitre suivant présente le projet auquel ce</w:t>
+      </w:r>
+      <w:r>
+        <w:t xml:space="preserve"> </w:t>
+      </w:r>
+      <w:r>
+        <w:t xml:space="preserve">travail de structure ouvrait la voie : le Copilote Financier, un outil d’aide à la décision construit sur les</w:t>
       </w:r>
       <w:r>
         <w:t xml:space="preserve"> </w:t>

</xml_diff>